<commit_message>
fix: linked script and style files
</commit_message>
<xml_diff>
--- a/lab report.docx
+++ b/lab report.docx
@@ -2855,6 +2855,121 @@
     </w:p>
     <w:p>
       <w:pPr>
+        <w:spacing w:after="480"/>
+        <w:rPr>
+          <w:b/>
+          <w:bCs/>
+          <w:color w:val="0C3512" w:themeColor="accent3" w:themeShade="80"/>
+          <w:u w:val="single"/>
+        </w:rPr>
+      </w:pPr>
+      <w:r>
+        <w:rPr>
+          <w:b/>
+          <w:bCs/>
+          <w:color w:val="0C3512" w:themeColor="accent3" w:themeShade="80"/>
+          <w:u w:val="single"/>
+        </w:rPr>
+        <w:t>5. GITHUB LINK AND SCREENSHOT:</w:t>
+      </w:r>
+    </w:p>
+    <w:p>
+      <w:pPr>
+        <w:spacing w:after="480"/>
+      </w:pPr>
+      <w:r>
+        <w:rPr>
+          <w:b/>
+          <w:bCs/>
+          <w:color w:val="0C3512" w:themeColor="accent3" w:themeShade="80"/>
+        </w:rPr>
+        <w:t>LINK</w:t>
+      </w:r>
+      <w:r>
+        <w:rPr>
+          <w:b/>
+          <w:bCs/>
+        </w:rPr>
+        <w:t xml:space="preserve">: </w:t>
+      </w:r>
+      <w:hyperlink r:id="rId13" w:history="1">
+        <w:r>
+          <w:rPr>
+            <w:rStyle w:val="Hyperlink"/>
+          </w:rPr>
+          <w:t>https://github.com/tooba245/MID-EXAM</w:t>
+        </w:r>
+      </w:hyperlink>
+    </w:p>
+    <w:p>
+      <w:pPr>
+        <w:spacing w:after="480"/>
+        <w:rPr>
+          <w:b/>
+          <w:bCs/>
+          <w:color w:val="0C3512" w:themeColor="accent3" w:themeShade="80"/>
+        </w:rPr>
+      </w:pPr>
+      <w:r>
+        <w:rPr>
+          <w:b/>
+          <w:bCs/>
+          <w:color w:val="0C3512" w:themeColor="accent3" w:themeShade="80"/>
+        </w:rPr>
+        <w:t>SCREENSHOT:</w:t>
+      </w:r>
+    </w:p>
+    <w:p>
+      <w:pPr>
+        <w:spacing w:after="480"/>
+        <w:rPr>
+          <w:b/>
+          <w:bCs/>
+        </w:rPr>
+      </w:pPr>
+      <w:r>
+        <w:rPr>
+          <w:noProof/>
+        </w:rPr>
+        <w:drawing>
+          <wp:inline distT="0" distB="0" distL="0" distR="0" wp14:anchorId="7135C402" wp14:editId="500F083F">
+            <wp:extent cx="5731510" cy="3222625"/>
+            <wp:effectExtent l="0" t="0" r="2540" b="0"/>
+            <wp:docPr id="973715511" name="Picture 1"/>
+            <wp:cNvGraphicFramePr>
+              <a:graphicFrameLocks xmlns:a="http://schemas.openxmlformats.org/drawingml/2006/main" noChangeAspect="1"/>
+            </wp:cNvGraphicFramePr>
+            <a:graphic xmlns:a="http://schemas.openxmlformats.org/drawingml/2006/main">
+              <a:graphicData uri="http://schemas.openxmlformats.org/drawingml/2006/picture">
+                <pic:pic xmlns:pic="http://schemas.openxmlformats.org/drawingml/2006/picture">
+                  <pic:nvPicPr>
+                    <pic:cNvPr id="973715511" name=""/>
+                    <pic:cNvPicPr/>
+                  </pic:nvPicPr>
+                  <pic:blipFill>
+                    <a:blip r:embed="rId14"/>
+                    <a:stretch>
+                      <a:fillRect/>
+                    </a:stretch>
+                  </pic:blipFill>
+                  <pic:spPr>
+                    <a:xfrm>
+                      <a:off x="0" y="0"/>
+                      <a:ext cx="5731510" cy="3222625"/>
+                    </a:xfrm>
+                    <a:prstGeom prst="rect">
+                      <a:avLst/>
+                    </a:prstGeom>
+                  </pic:spPr>
+                </pic:pic>
+              </a:graphicData>
+            </a:graphic>
+          </wp:inline>
+        </w:drawing>
+      </w:r>
+    </w:p>
+    <w:p>
+      <w:pPr>
         <w:spacing w:after="80"/>
         <w:jc w:val="right"/>
       </w:pPr>
@@ -3082,6 +3197,92 @@
     </w:lvl>
   </w:abstractNum>
   <w:abstractNum w:abstractNumId="2" w15:restartNumberingAfterBreak="0">
+    <w:nsid w:val="5B865FEF"/>
+    <w:multiLevelType w:val="hybridMultilevel"/>
+    <w:tmpl w:val="1C20540A"/>
+    <w:lvl w:ilvl="0" w:tplc="0409000F">
+      <w:start w:val="1"/>
+      <w:numFmt w:val="decimal"/>
+      <w:lvlText w:val="%1."/>
+      <w:lvlJc w:val="left"/>
+      <w:pPr>
+        <w:ind w:left="720" w:hanging="360"/>
+      </w:pPr>
+    </w:lvl>
+    <w:lvl w:ilvl="1" w:tplc="04090019" w:tentative="1">
+      <w:start w:val="1"/>
+      <w:numFmt w:val="lowerLetter"/>
+      <w:lvlText w:val="%2."/>
+      <w:lvlJc w:val="left"/>
+      <w:pPr>
+        <w:ind w:left="1440" w:hanging="360"/>
+      </w:pPr>
+    </w:lvl>
+    <w:lvl w:ilvl="2" w:tplc="0409001B" w:tentative="1">
+      <w:start w:val="1"/>
+      <w:numFmt w:val="lowerRoman"/>
+      <w:lvlText w:val="%3."/>
+      <w:lvlJc w:val="right"/>
+      <w:pPr>
+        <w:ind w:left="2160" w:hanging="180"/>
+      </w:pPr>
+    </w:lvl>
+    <w:lvl w:ilvl="3" w:tplc="0409000F" w:tentative="1">
+      <w:start w:val="1"/>
+      <w:numFmt w:val="decimal"/>
+      <w:lvlText w:val="%4."/>
+      <w:lvlJc w:val="left"/>
+      <w:pPr>
+        <w:ind w:left="2880" w:hanging="360"/>
+      </w:pPr>
+    </w:lvl>
+    <w:lvl w:ilvl="4" w:tplc="04090019" w:tentative="1">
+      <w:start w:val="1"/>
+      <w:numFmt w:val="lowerLetter"/>
+      <w:lvlText w:val="%5."/>
+      <w:lvlJc w:val="left"/>
+      <w:pPr>
+        <w:ind w:left="3600" w:hanging="360"/>
+      </w:pPr>
+    </w:lvl>
+    <w:lvl w:ilvl="5" w:tplc="0409001B" w:tentative="1">
+      <w:start w:val="1"/>
+      <w:numFmt w:val="lowerRoman"/>
+      <w:lvlText w:val="%6."/>
+      <w:lvlJc w:val="right"/>
+      <w:pPr>
+        <w:ind w:left="4320" w:hanging="180"/>
+      </w:pPr>
+    </w:lvl>
+    <w:lvl w:ilvl="6" w:tplc="0409000F" w:tentative="1">
+      <w:start w:val="1"/>
+      <w:numFmt w:val="decimal"/>
+      <w:lvlText w:val="%7."/>
+      <w:lvlJc w:val="left"/>
+      <w:pPr>
+        <w:ind w:left="5040" w:hanging="360"/>
+      </w:pPr>
+    </w:lvl>
+    <w:lvl w:ilvl="7" w:tplc="04090019" w:tentative="1">
+      <w:start w:val="1"/>
+      <w:numFmt w:val="lowerLetter"/>
+      <w:lvlText w:val="%8."/>
+      <w:lvlJc w:val="left"/>
+      <w:pPr>
+        <w:ind w:left="5760" w:hanging="360"/>
+      </w:pPr>
+    </w:lvl>
+    <w:lvl w:ilvl="8" w:tplc="0409001B" w:tentative="1">
+      <w:start w:val="1"/>
+      <w:numFmt w:val="lowerRoman"/>
+      <w:lvlText w:val="%9."/>
+      <w:lvlJc w:val="right"/>
+      <w:pPr>
+        <w:ind w:left="6480" w:hanging="180"/>
+      </w:pPr>
+    </w:lvl>
+  </w:abstractNum>
+  <w:abstractNum w:abstractNumId="3" w15:restartNumberingAfterBreak="0">
     <w:nsid w:val="6A754961"/>
     <w:multiLevelType w:val="hybridMultilevel"/>
     <w:tmpl w:val="FFFFFFFF"/>
@@ -3135,7 +3336,7 @@
       <w:lvlJc w:val="left"/>
     </w:lvl>
   </w:abstractNum>
-  <w:abstractNum w:abstractNumId="3" w15:restartNumberingAfterBreak="0">
+  <w:abstractNum w:abstractNumId="4" w15:restartNumberingAfterBreak="0">
     <w:nsid w:val="6BF30DD4"/>
     <w:multiLevelType w:val="hybridMultilevel"/>
     <w:tmpl w:val="FFFFFFFF"/>
@@ -3196,13 +3397,16 @@
     </w:lvlOverride>
   </w:num>
   <w:num w:numId="2" w16cid:durableId="1639188385">
-    <w:abstractNumId w:val="3"/>
+    <w:abstractNumId w:val="4"/>
     <w:lvlOverride w:ilvl="0">
       <w:startOverride w:val="1"/>
     </w:lvlOverride>
   </w:num>
   <w:num w:numId="3" w16cid:durableId="786847589">
     <w:abstractNumId w:val="0"/>
+  </w:num>
+  <w:num w:numId="4" w16cid:durableId="471555023">
+    <w:abstractNumId w:val="2"/>
   </w:num>
 </w:numbering>
 </file>
@@ -3871,6 +4075,18 @@
       </w:tblCellMar>
     </w:tblPr>
   </w:style>
+  <w:style w:type="character" w:styleId="UnresolvedMention">
+    <w:name w:val="Unresolved Mention"/>
+    <w:basedOn w:val="DefaultParagraphFont"/>
+    <w:uiPriority w:val="99"/>
+    <w:semiHidden/>
+    <w:unhideWhenUsed/>
+    <w:rsid w:val="009179C5"/>
+    <w:rPr>
+      <w:color w:val="605E5C"/>
+      <w:shd w:val="clear" w:color="auto" w:fill="E1DFDD"/>
+    </w:rPr>
+  </w:style>
 </w:styles>
 </file>
 

</xml_diff>